<commit_message>
Fix Hidden Springs bulletin formatting: multi-row songs, Gloria sections, back cover layout
- Songs now render in 1×N tables (one row per verse/chorus) instead of 1×1,
  preventing overly tall single cells in large-print format
- Gloria restructured as four separate keep-together sections matching BCP
- Back cover upcoming services now formatted with bold date/time, normal title,
  and italic clergy role using OpenXML-level run construction
- Add Annunciation collect to collects.yaml
- Fix Canticle 15 versification to match BCP and normalize second_half handling
- Update Gloria in common_prayers.yaml to sections format (list of lists)

Co-Authored-By: Claude Opus 4.6 <noreply@anthropic.com>
</commit_message>
<xml_diff>
--- a/templates/senior_living_front_cover.docx
+++ b/templates/senior_living_front_cover.docx
@@ -605,18 +605,24 @@
           <w:sz w:val="42"/>
           <w:szCs w:val="42"/>
         </w:rPr>
-        <w:t xml:space="preserve">St. Andrew’s Episcopal </w:t>
+        <w:t>St. Andrew’s Episcopal Chu</w:t>
       </w:r>
-      <w:proofErr w:type="spellStart"/>
       <w:r>
         <w:rPr>
           <w:rFonts w:ascii="Gill Sans Nova Medium" w:hAnsi="Gill Sans Nova Medium"/>
           <w:sz w:val="42"/>
           <w:szCs w:val="42"/>
         </w:rPr>
-        <w:t>Chruch</w:t>
+        <w:t>r</w:t>
       </w:r>
-      <w:proofErr w:type="spellEnd"/>
+      <w:r>
+        <w:rPr>
+          <w:rFonts w:ascii="Gill Sans Nova Medium" w:hAnsi="Gill Sans Nova Medium"/>
+          <w:sz w:val="42"/>
+          <w:szCs w:val="42"/>
+        </w:rPr>
+        <w:t>ch</w:t>
+      </w:r>
     </w:p>
     <w:p>
       <w:pPr>

</xml_diff>